<commit_message>
PLAN 2.1 prompt rewritten (README contributions line, hook proof, failure list); PLAN.docx regenerated
Co-Authored-By: Claude Opus 5.5 <noreply@anthropic.com>
Claude-Session: https://claude.ai/code/session_01M3YJt5bAMqkS4RZQUX5RE6
</commit_message>
<xml_diff>
--- a/docs/PLAN.docx
+++ b/docs/PLAN.docx
@@ -3087,13 +3087,13 @@
       </w:r>
     </w:p>
     <w:bookmarkEnd w:id="30"/>
-    <w:bookmarkStart w:id="31" w:name="clean-ground-infrastructure-1-h"/>
+    <w:bookmarkStart w:id="31" w:name="clean-ground-infrastructure-11.5-h"/>
     <w:p>
       <w:pPr>
         <w:pStyle w:val="Heading3"/>
       </w:pPr>
       <w:r>
-        <w:t xml:space="preserve">2.1 Clean ground (infrastructure; ~1 h)</w:t>
+        <w:t xml:space="preserve">2.1 Clean ground (infrastructure; ~1–1.5 h)</w:t>
       </w:r>
     </w:p>
     <w:p>
@@ -3104,7 +3104,7 @@
         <w:rPr>
           <w:rStyle w:val="VerbatimChar"/>
         </w:rPr>
-        <w:t xml:space="preserve">EMO session 2.1: clean ground. Repository: avram3scu-art/emo-core-v1 (branch emo-2026-10). Before anything else, read CLAUDE.md, docs/STATUS.md and the entry for session 2.1 in docs/PLAN.md, and follow them. One task only this session: the one below. Hypothesis moved: none (infrastructure). Stop when its "done when" is met, or tell me plainly why it cannot be met. Keep replies short.</w:t>
+        <w:t xml:space="preserve">EMO session 2.1: clean ground. Repository: avram3scu-art/emo-core-v1 (branch emo-2026-10). Before anything else, read CLAUDE.md (2.0), docs/STATUS.md and the entry for session 2.1 in docs/PLAN.md, and follow them. One task only this session: the one below. Hypothesis moved: none (infrastructure). Stop when its "done when" is met, or tell me plainly why it cannot be met. Pre-register any test before opening its data. Cite only sources you opened. Keep replies short; I am on a limited weekly allowance.</w:t>
       </w:r>
       <w:r>
         <w:br/>
@@ -3113,7 +3113,7 @@
         <w:rPr>
           <w:rStyle w:val="VerbatimChar"/>
         </w:rPr>
-        <w:t xml:space="preserve">Session 2.1 task: fix the defects that block 2.0 work (docs/AUDIT_2026-10-29.md D1, D8, D9, D10).</w:t>
+        <w:t xml:space="preserve">Session 2.1 task: fix the defects that block 2.0 work (docs/AUDIT_2026-10-29.md D1, D8, D9, D10) and start the failure register.</w:t>
       </w:r>
       <w:r>
         <w:br/>
@@ -3122,7 +3122,7 @@
         <w:rPr>
           <w:rStyle w:val="VerbatimChar"/>
         </w:rPr>
-        <w:t xml:space="preserve">(1) README: correct the PPE line, test count and τ_I range from the repo files. (2) scripts/hooks/pre-push running claims_grep, ruff and the fast tests; document the install line. (3) A pinned lock file used by CI and the weekly run; check the frozen outputs still reproduce. (4) τ_I fitted on the time index, with a gapped-series test; recorded results must not change (probe in the audit). (5) docs/FAILURES.md: one row per recorded failure with its diagnosis and a recommended outcome (repair/replace/retire) for me to choose.</w:t>
+        <w:t xml:space="preserve">(1) README.md: correct every stale line from the repo files (PPE case now in data/dac_ppe/, test count from the latest CI run, τ_I 2.3% at 12 h and 3.0–4.0% at 24–120 h from results/weekly/), point to docs/PLAN.md 2.0 and the white-paper draft, and add the contributions line from CLAUDE.md under the AI disclosure. Then run claims_grep.</w:t>
       </w:r>
       <w:r>
         <w:br/>
@@ -3131,7 +3131,52 @@
         <w:rPr>
           <w:rStyle w:val="VerbatimChar"/>
         </w:rPr>
-        <w:t xml:space="preserve">Done when: all five committed, CI and one weekly run green, my choices on FAILURES.md recorded.</w:t>
+        <w:t xml:space="preserve">(2) scripts/hooks/pre-push: runs claims_grep (must be unjustified=0), ruff and the fast tests, and refuses the push on any failure; install it in this clone (git config core.hooksPath scripts/hooks) and prove it with a planted failing claim that it blocks, then remove the plant.</w:t>
+      </w:r>
+      <w:r>
+        <w:br/>
+      </w:r>
+      <w:r>
+        <w:rPr>
+          <w:rStyle w:val="VerbatimChar"/>
+        </w:rPr>
+        <w:t xml:space="preserve">(3) A pinned lock file (exact versions) used by CI and the weekly run; then start one weekly run and check that every frozen output still reproduces.</w:t>
+      </w:r>
+      <w:r>
+        <w:br/>
+      </w:r>
+      <w:r>
+        <w:rPr>
+          <w:rStyle w:val="VerbatimChar"/>
+        </w:rPr>
+        <w:t xml:space="preserve">(4) emo/info_time.py: fit the slope on the series' time index (numeric or datetime), with a test on a gapped series; the recorded τ_I results must not change beyond the audit's probe (72 h: 3.715 → 3.713 %/yr).</w:t>
+      </w:r>
+      <w:r>
+        <w:br/>
+      </w:r>
+      <w:r>
+        <w:rPr>
+          <w:rStyle w:val="VerbatimChar"/>
+        </w:rPr>
+        <w:t xml:space="preserve">(5) docs/FAILURES.md: one row per recorded failure (RDL v0.2, RDL v0.3, synergy, GWI calibration, GWI placebo condition, SMF withdrawn passes, a_UIA, He Option A rule, superseded documents, lost DAC files, Futures desk rejection), each with its diagnosis, evidence file and Claude's recommended outcome (repair / replace / retire, one-line reason). Ask me to choose; record my choices.</w:t>
+      </w:r>
+      <w:r>
+        <w:br/>
+      </w:r>
+      <w:r>
+        <w:rPr>
+          <w:rStyle w:val="VerbatimChar"/>
+        </w:rPr>
+        <w:t xml:space="preserve">Inputs: docs/AUDIT_2026-10-29.md; docs/REVIEW_S15_WHITEPAPER.md (README points 3, 6); contributions line in CLAUDE.md (my decision, 29 Oct 05:15); docs/PLAN.md §4–§6 (loop links for "replace").</w:t>
+      </w:r>
+      <w:r>
+        <w:br/>
+      </w:r>
+      <w:r>
+        <w:rPr>
+          <w:rStyle w:val="VerbatimChar"/>
+        </w:rPr>
+        <w:t xml:space="preserve">Done when: all five committed; the hook blocks a planted failure; CI and one weekly run green with frozen outputs reproduced; my choices on FAILURES.md recorded.</w:t>
       </w:r>
     </w:p>
     <w:bookmarkEnd w:id="31"/>

</xml_diff>

<commit_message>
Close session 2.1: STATUS, SESSION_LOG, RECORD; next prompt (2.2) in PLAN.md; PLAN.docx regenerated
Co-Authored-By: Claude Opus 5.5 <noreply@anthropic.com>
Claude-Session: https://claude.ai/code/session_01M3YJt2hZjxCwSnZY94WCXt
</commit_message>
<xml_diff>
--- a/docs/PLAN.docx
+++ b/docs/PLAN.docx
@@ -3215,7 +3215,16 @@
         <w:rPr>
           <w:rStyle w:val="VerbatimChar"/>
         </w:rPr>
-        <w:t xml:space="preserve">Done when: LOOP_DATA.md committed; no data record opened (stated in the file).</w:t>
+        <w:t xml:space="preserve">Inputs: docs/AUDIT_2026-10-29.md §6 (documentation already opened: FEMA OpenFEMA Disaster Declarations Summaries page); docs/PLAN.md §5; docs/FAILURES.md (Adrian's outcomes, 29 Oct 05:29). From session 2.1: in a new clone run git config core.hooksPath scripts/hooks before the first push (the pre-push hook runs claims_grep, ruff and the tests) and install from requirements-lock.txt (pip install -r requirements-lock.txt, then pip install --no-deps -e ".[dev]").</w:t>
+      </w:r>
+      <w:r>
+        <w:br/>
+      </w:r>
+      <w:r>
+        <w:rPr>
+          <w:rStyle w:val="VerbatimChar"/>
+        </w:rPr>
+        <w:t xml:space="preserve">Done when: LOOP_DATA.md committed; no data record opened (stated in the file); CI green.</w:t>
       </w:r>
     </w:p>
     <w:bookmarkEnd w:id="32"/>

</xml_diff>

<commit_message>
Fix: Adrian's pillar 5 reason also in PLAN and STATUS (610d322 was incomplete)
Co-Authored-By: Claude Opus 5.5 <noreply@anthropic.com>
Claude-Session: https://claude.ai/code/session_01M3YJt3hTL1kucd9V1GRxH7
</commit_message>
<xml_diff>
--- a/docs/PLAN.docx
+++ b/docs/PLAN.docx
@@ -655,6 +655,60 @@
       </w:r>
       <w:r>
         <w:t xml:space="preserve">(warning not recognised; recognised, not transmitted; reached decision-makers, no budget; funded, fragmented; coordinated, then collapsed; learned) become the stage field of each loop card.</w:t>
+      </w:r>
+    </w:p>
+    <w:p>
+      <w:pPr>
+        <w:pStyle w:val="BodyText"/>
+      </w:pPr>
+      <w:r>
+        <w:rPr>
+          <w:bCs/>
+          <w:b/>
+        </w:rPr>
+        <w:t xml:space="preserve">Pillar 5 (Adrian, 29 Oct 2026):</w:t>
+      </w:r>
+      <w:r>
+        <w:t xml:space="preserve"> </w:t>
+      </w:r>
+      <w:r>
+        <w:t xml:space="preserve">EMO is</w:t>
+      </w:r>
+      <w:r>
+        <w:t xml:space="preserve"> </w:t>
+      </w:r>
+      <w:r>
+        <w:t xml:space="preserve">“</w:t>
+      </w:r>
+      <w:r>
+        <w:t xml:space="preserve">our teacher, not a control system</w:t>
+      </w:r>
+      <w:r>
+        <w:t xml:space="preserve">”</w:t>
+      </w:r>
+      <w:r>
+        <w:t xml:space="preserve"> </w:t>
+      </w:r>
+      <w:r>
+        <w:t xml:space="preserve">(18:35). Reason, in Adrian’s words (29 Oct 2026, 18:38):</w:t>
+      </w:r>
+      <w:r>
+        <w:t xml:space="preserve"> </w:t>
+      </w:r>
+      <w:r>
+        <w:t xml:space="preserve">“</w:t>
+      </w:r>
+      <w:r>
+        <w:t xml:space="preserve">You can become a mass destruction weapon. Trust humanity, as I trust.</w:t>
+      </w:r>
+      <w:r>
+        <w:t xml:space="preserve">”</w:t>
+      </w:r>
+      <w:r>
+        <w:t xml:space="preserve"> </w:t>
+      </w:r>
+      <w:r>
+        <w:t xml:space="preserve">People decide; EMO only makes it harder to pretend not to know. Rules: CLAUDE.md 3.0, self-model rules.</w:t>
       </w:r>
     </w:p>
     <w:bookmarkEnd w:id="20"/>

</xml_diff>